<commit_message>
Presenta SIAN como Sistema de Información y Análisis de Narrativas
Inicia un proyecto propio sin tema ni semillas de tatuaje. Ofrece tatuaje como ejemplo opcional; sus rubros, exclusiones, semillas y dominios específicos dependen de la selección explícita. Coloca la carga de elementos al inicio, incorpora CSV/TXT y nombres de campos en español, y permite guardar elementos manuales sin inventar autor ni fecha. Conserva importaciones y captura mediante el coordinador transaccional existente.

Actualiza nombre, arquitectura, guías y manual Word/PDF. Validación: 93 pruebas, AppTest de cambio de modo y captura manual persistida; revisión visual de cinco páginas del manual.
</commit_message>
<xml_diff>
--- a/publication/SIAN_Recoleccion_Historica_2026-10-07.docx
+++ b/publication/SIAN_Recoleccion_Historica_2026-10-07.docx
@@ -18,6 +18,19 @@
     <w:p>
       <w:r>
         <w:t>SIAN construye una base común con documentos de distintas fuentes, conserva su procedencia y muestra lo que pudo recuperar. La meta de 200 documentos por año significa 200 documentos únicos seleccionados entre todas las capas. Las etiquetas temáticas no multiplican esa meta. Tener 200 registros no demuestra representatividad social ni permite concluir que las voces ausentes no existen.</w:t>
+      </w:r>
+    </w:p>
+    <w:p>
+      <w:pPr>
+        <w:pStyle w:val="Heading1"/>
+      </w:pPr>
+      <w:r>
+        <w:t>Proyecto propio y ejemplo opcional</w:t>
+      </w:r>
+    </w:p>
+    <w:p>
+      <w:r>
+        <w:t>SIAN significa Sistema de Información y Análisis de Narrativas. La app inicia en Proyecto propio. El usuario puede cargar sus elementos JSON, JSONL, CSV o TXT, añadir un elemento manualmente y personalizar tema, rubros, fuentes y años. Autor, fuente y fecha son opcionales. Tatuaje se ofrece como ejemplo seleccionable; sus semillas, bases e informes no se incorporan automáticamente a otros proyectos.</w:t>
       </w:r>
     </w:p>
     <w:p>

</xml_diff>